<commit_message>
Cover letter: remove placeholders
Co-Authored-By: Claude Sonnet 5.5 <noreply@anthropic.com>
Claude-Session: https://claude.ai/code/session_01XZw1JarumhAukSj5YHuKc2
</commit_message>
<xml_diff>
--- a/paper/EJIS_cover_letter.docx
+++ b/paper/EJIS_cover_letter.docx
@@ -12,7 +12,7 @@
           <w:sz w:val="23"/>
           <w:szCs w:val="23"/>
         </w:rPr>
-        <w:t xml:space="preserve">[Date]</w:t>
+        <w:t xml:space="preserve">September 30, 2026</w:t>
       </w:r>
     </w:p>
     <w:p>
@@ -38,20 +38,7 @@
           <w:sz w:val="23"/>
           <w:szCs w:val="23"/>
         </w:rPr>
-        <w:t xml:space="preserve">[Editor name]</w:t>
-      </w:r>
-    </w:p>
-    <w:p>
-      <w:pPr>
-        <w:spacing w:after="0" w:line="276"/>
-      </w:pPr>
-      <w:r>
-        <w:rPr>
-          <w:rFonts w:ascii="Times New Roman" w:cs="Times New Roman" w:eastAsia="Times New Roman" w:hAnsi="Times New Roman"/>
-          <w:sz w:val="23"/>
-          <w:szCs w:val="23"/>
-        </w:rPr>
-        <w:t xml:space="preserve">Editor-in-Chief</w:t>
+        <w:t xml:space="preserve">The Editor-in-Chief</w:t>
       </w:r>
     </w:p>
     <w:p>
@@ -91,7 +78,7 @@
           <w:sz w:val="23"/>
           <w:szCs w:val="23"/>
         </w:rPr>
-        <w:t xml:space="preserve">Dear [Editor name],</w:t>
+        <w:t xml:space="preserve">Dear Editor,</w:t>
       </w:r>
     </w:p>
     <w:p>
@@ -175,7 +162,7 @@
           <w:sz w:val="23"/>
           <w:szCs w:val="23"/>
         </w:rPr>
-        <w:t xml:space="preserve">The manuscript is approximately [5,800] words in the main text, within the journal’s limit for first submissions, and is anonymised for review. [Confirm before sending: the work is original, is not under consideration elsewhere, and all authors approve the submission. State any conflicts of interest. State how generative AI tools were used in preparing the manuscript, code, and analyses, in line with the publisher’s policy.]</w:t>
+        <w:t xml:space="preserve">The manuscript is approximately 5,800 words in the main text, within the journal’s limit for first submissions, and is anonymised for review.</w:t>
       </w:r>
     </w:p>
     <w:p>
@@ -189,7 +176,7 @@
           <w:sz w:val="23"/>
           <w:szCs w:val="23"/>
         </w:rPr>
-        <w:t xml:space="preserve">Thank you for considering our work. We would be glad to suggest reviewers with expertise in delegation to agentic IS, behavioral decision theory in IS, and LLM agent evaluation on request.</w:t>
+        <w:t xml:space="preserve">Thank you for considering our work.</w:t>
       </w:r>
     </w:p>
     <w:p>
@@ -229,33 +216,7 @@
           <w:sz w:val="23"/>
           <w:szCs w:val="23"/>
         </w:rPr>
-        <w:t xml:space="preserve">[Corresponding author name]</w:t>
-      </w:r>
-    </w:p>
-    <w:p>
-      <w:pPr>
-        <w:spacing w:after="0" w:line="276"/>
-      </w:pPr>
-      <w:r>
-        <w:rPr>
-          <w:rFonts w:ascii="Times New Roman" w:cs="Times New Roman" w:eastAsia="Times New Roman" w:hAnsi="Times New Roman"/>
-          <w:sz w:val="23"/>
-          <w:szCs w:val="23"/>
-        </w:rPr>
-        <w:t xml:space="preserve">[Affiliation]</w:t>
-      </w:r>
-    </w:p>
-    <w:p>
-      <w:pPr>
-        <w:spacing w:after="0" w:line="276"/>
-      </w:pPr>
-      <w:r>
-        <w:rPr>
-          <w:rFonts w:ascii="Times New Roman" w:cs="Times New Roman" w:eastAsia="Times New Roman" w:hAnsi="Times New Roman"/>
-          <w:sz w:val="23"/>
-          <w:szCs w:val="23"/>
-        </w:rPr>
-        <w:t xml:space="preserve">[Email]</w:t>
+        <w:t xml:space="preserve">The authors</w:t>
       </w:r>
     </w:p>
     <w:sectPr>

</xml_diff>

<commit_message>
Add author-info manuscript, title page; author signature in cover letter
Co-Authored-By: Claude Sonnet 5.5 <noreply@anthropic.com>
Claude-Session: https://claude.ai/code/session_01XZw1JarumhAukSj5YHuKc2
</commit_message>
<xml_diff>
--- a/paper/EJIS_cover_letter.docx
+++ b/paper/EJIS_cover_letter.docx
@@ -216,7 +216,46 @@
           <w:sz w:val="23"/>
           <w:szCs w:val="23"/>
         </w:rPr>
-        <w:t xml:space="preserve">The authors</w:t>
+        <w:t xml:space="preserve">Ook Lee</w:t>
+      </w:r>
+    </w:p>
+    <w:p>
+      <w:pPr>
+        <w:spacing w:after="0" w:line="276"/>
+      </w:pPr>
+      <w:r>
+        <w:rPr>
+          <w:rFonts w:ascii="Times New Roman" w:cs="Times New Roman" w:eastAsia="Times New Roman" w:hAnsi="Times New Roman"/>
+          <w:sz w:val="23"/>
+          <w:szCs w:val="23"/>
+        </w:rPr>
+        <w:t xml:space="preserve">Department of Information Systems</w:t>
+      </w:r>
+    </w:p>
+    <w:p>
+      <w:pPr>
+        <w:spacing w:after="0" w:line="276"/>
+      </w:pPr>
+      <w:r>
+        <w:rPr>
+          <w:rFonts w:ascii="Times New Roman" w:cs="Times New Roman" w:eastAsia="Times New Roman" w:hAnsi="Times New Roman"/>
+          <w:sz w:val="23"/>
+          <w:szCs w:val="23"/>
+        </w:rPr>
+        <w:t xml:space="preserve">Hanyang University, Seoul, Korea</w:t>
+      </w:r>
+    </w:p>
+    <w:p>
+      <w:pPr>
+        <w:spacing w:after="0" w:line="276"/>
+      </w:pPr>
+      <w:r>
+        <w:rPr>
+          <w:rFonts w:ascii="Times New Roman" w:cs="Times New Roman" w:eastAsia="Times New Roman" w:hAnsi="Times New Roman"/>
+          <w:sz w:val="23"/>
+          <w:szCs w:val="23"/>
+        </w:rPr>
+        <w:t xml:space="preserve">ooklee@hanyang.ac.kr</w:t>
       </w:r>
     </w:p>
     <w:sectPr>

</xml_diff>